<commit_message>
chore(estructura): inicializa proyecto Delantal Digital con estructura base
</commit_message>
<xml_diff>
--- a/doc/Documentacion.docx
+++ b/doc/Documentacion.docx
@@ -319,6 +319,680 @@
         </w:drawing>
       </w:r>
     </w:p>
+    <w:p/>
+    <w:p>
+      <w:r>
+        <w:t>Dando el comando git add . tenemos el siguiente resultado</w:t>
+      </w:r>
+    </w:p>
+    <w:p>
+      <w:r>
+        <w:lastRenderedPageBreak/>
+        <w:drawing>
+          <wp:inline distT="0" distB="0" distL="0" distR="0" wp14:anchorId="410095D5" wp14:editId="68F91431">
+            <wp:extent cx="5612130" cy="2868930"/>
+            <wp:effectExtent l="0" t="0" r="7620" b="7620"/>
+            <wp:docPr id="523786990" name="Imagen 1"/>
+            <wp:cNvGraphicFramePr>
+              <a:graphicFrameLocks xmlns:a="http://schemas.openxmlformats.org/drawingml/2006/main" noChangeAspect="1"/>
+            </wp:cNvGraphicFramePr>
+            <a:graphic xmlns:a="http://schemas.openxmlformats.org/drawingml/2006/main">
+              <a:graphicData uri="http://schemas.openxmlformats.org/drawingml/2006/picture">
+                <pic:pic xmlns:pic="http://schemas.openxmlformats.org/drawingml/2006/picture">
+                  <pic:nvPicPr>
+                    <pic:cNvPr id="523786990" name=""/>
+                    <pic:cNvPicPr/>
+                  </pic:nvPicPr>
+                  <pic:blipFill>
+                    <a:blip r:embed="rId11"/>
+                    <a:stretch>
+                      <a:fillRect/>
+                    </a:stretch>
+                  </pic:blipFill>
+                  <pic:spPr>
+                    <a:xfrm>
+                      <a:off x="0" y="0"/>
+                      <a:ext cx="5612130" cy="2868930"/>
+                    </a:xfrm>
+                    <a:prstGeom prst="rect">
+                      <a:avLst/>
+                    </a:prstGeom>
+                  </pic:spPr>
+                </pic:pic>
+              </a:graphicData>
+            </a:graphic>
+          </wp:inline>
+        </w:drawing>
+      </w:r>
+    </w:p>
+    <w:p>
+      <w:r>
+        <w:drawing>
+          <wp:inline distT="0" distB="0" distL="0" distR="0" wp14:anchorId="0913EAC8" wp14:editId="27572272">
+            <wp:extent cx="2270760" cy="4191700"/>
+            <wp:effectExtent l="0" t="0" r="0" b="0"/>
+            <wp:docPr id="872792187" name="Imagen 1"/>
+            <wp:cNvGraphicFramePr>
+              <a:graphicFrameLocks xmlns:a="http://schemas.openxmlformats.org/drawingml/2006/main" noChangeAspect="1"/>
+            </wp:cNvGraphicFramePr>
+            <a:graphic xmlns:a="http://schemas.openxmlformats.org/drawingml/2006/main">
+              <a:graphicData uri="http://schemas.openxmlformats.org/drawingml/2006/picture">
+                <pic:pic xmlns:pic="http://schemas.openxmlformats.org/drawingml/2006/picture">
+                  <pic:nvPicPr>
+                    <pic:cNvPr id="872792187" name=""/>
+                    <pic:cNvPicPr/>
+                  </pic:nvPicPr>
+                  <pic:blipFill>
+                    <a:blip r:embed="rId12"/>
+                    <a:stretch>
+                      <a:fillRect/>
+                    </a:stretch>
+                  </pic:blipFill>
+                  <pic:spPr>
+                    <a:xfrm>
+                      <a:off x="0" y="0"/>
+                      <a:ext cx="2272534" cy="4194974"/>
+                    </a:xfrm>
+                    <a:prstGeom prst="rect">
+                      <a:avLst/>
+                    </a:prstGeom>
+                  </pic:spPr>
+                </pic:pic>
+              </a:graphicData>
+            </a:graphic>
+          </wp:inline>
+        </w:drawing>
+      </w:r>
+    </w:p>
+    <w:p/>
+    <w:p/>
+    <w:p>
+      <w:r>
+        <w:lastRenderedPageBreak/>
+        <w:t>Ahora hacemos un commit de forma profesional desde la terminal</w:t>
+      </w:r>
+    </w:p>
+    <w:p>
+      <w:r>
+        <w:drawing>
+          <wp:inline distT="0" distB="0" distL="0" distR="0" wp14:anchorId="712AA0CC" wp14:editId="792611C3">
+            <wp:extent cx="5612130" cy="3859530"/>
+            <wp:effectExtent l="0" t="0" r="7620" b="7620"/>
+            <wp:docPr id="943845822" name="Imagen 1"/>
+            <wp:cNvGraphicFramePr>
+              <a:graphicFrameLocks xmlns:a="http://schemas.openxmlformats.org/drawingml/2006/main" noChangeAspect="1"/>
+            </wp:cNvGraphicFramePr>
+            <a:graphic xmlns:a="http://schemas.openxmlformats.org/drawingml/2006/main">
+              <a:graphicData uri="http://schemas.openxmlformats.org/drawingml/2006/picture">
+                <pic:pic xmlns:pic="http://schemas.openxmlformats.org/drawingml/2006/picture">
+                  <pic:nvPicPr>
+                    <pic:cNvPr id="943845822" name=""/>
+                    <pic:cNvPicPr/>
+                  </pic:nvPicPr>
+                  <pic:blipFill>
+                    <a:blip r:embed="rId13"/>
+                    <a:stretch>
+                      <a:fillRect/>
+                    </a:stretch>
+                  </pic:blipFill>
+                  <pic:spPr>
+                    <a:xfrm>
+                      <a:off x="0" y="0"/>
+                      <a:ext cx="5612130" cy="3859530"/>
+                    </a:xfrm>
+                    <a:prstGeom prst="rect">
+                      <a:avLst/>
+                    </a:prstGeom>
+                  </pic:spPr>
+                </pic:pic>
+              </a:graphicData>
+            </a:graphic>
+          </wp:inline>
+        </w:drawing>
+      </w:r>
+    </w:p>
+    <w:p/>
+    <w:p>
+      <w:r>
+        <w:t>Luego generamos un git push origin main</w:t>
+      </w:r>
+    </w:p>
+    <w:p>
+      <w:r>
+        <w:drawing>
+          <wp:inline distT="0" distB="0" distL="0" distR="0" wp14:anchorId="4B603BC0" wp14:editId="07AE7222">
+            <wp:extent cx="5612130" cy="1426210"/>
+            <wp:effectExtent l="0" t="0" r="7620" b="2540"/>
+            <wp:docPr id="278837307" name="Imagen 1"/>
+            <wp:cNvGraphicFramePr>
+              <a:graphicFrameLocks xmlns:a="http://schemas.openxmlformats.org/drawingml/2006/main" noChangeAspect="1"/>
+            </wp:cNvGraphicFramePr>
+            <a:graphic xmlns:a="http://schemas.openxmlformats.org/drawingml/2006/main">
+              <a:graphicData uri="http://schemas.openxmlformats.org/drawingml/2006/picture">
+                <pic:pic xmlns:pic="http://schemas.openxmlformats.org/drawingml/2006/picture">
+                  <pic:nvPicPr>
+                    <pic:cNvPr id="278837307" name=""/>
+                    <pic:cNvPicPr/>
+                  </pic:nvPicPr>
+                  <pic:blipFill>
+                    <a:blip r:embed="rId14"/>
+                    <a:stretch>
+                      <a:fillRect/>
+                    </a:stretch>
+                  </pic:blipFill>
+                  <pic:spPr>
+                    <a:xfrm>
+                      <a:off x="0" y="0"/>
+                      <a:ext cx="5612130" cy="1426210"/>
+                    </a:xfrm>
+                    <a:prstGeom prst="rect">
+                      <a:avLst/>
+                    </a:prstGeom>
+                  </pic:spPr>
+                </pic:pic>
+              </a:graphicData>
+            </a:graphic>
+          </wp:inline>
+        </w:drawing>
+      </w:r>
+    </w:p>
+    <w:p/>
+    <w:p>
+      <w:r>
+        <w:lastRenderedPageBreak/>
+        <w:drawing>
+          <wp:inline distT="0" distB="0" distL="0" distR="0" wp14:anchorId="67B31276" wp14:editId="1BA2379A">
+            <wp:extent cx="5612130" cy="2205990"/>
+            <wp:effectExtent l="0" t="0" r="7620" b="3810"/>
+            <wp:docPr id="1022175901" name="Imagen 1"/>
+            <wp:cNvGraphicFramePr>
+              <a:graphicFrameLocks xmlns:a="http://schemas.openxmlformats.org/drawingml/2006/main" noChangeAspect="1"/>
+            </wp:cNvGraphicFramePr>
+            <a:graphic xmlns:a="http://schemas.openxmlformats.org/drawingml/2006/main">
+              <a:graphicData uri="http://schemas.openxmlformats.org/drawingml/2006/picture">
+                <pic:pic xmlns:pic="http://schemas.openxmlformats.org/drawingml/2006/picture">
+                  <pic:nvPicPr>
+                    <pic:cNvPr id="1022175901" name=""/>
+                    <pic:cNvPicPr/>
+                  </pic:nvPicPr>
+                  <pic:blipFill>
+                    <a:blip r:embed="rId15"/>
+                    <a:stretch>
+                      <a:fillRect/>
+                    </a:stretch>
+                  </pic:blipFill>
+                  <pic:spPr>
+                    <a:xfrm>
+                      <a:off x="0" y="0"/>
+                      <a:ext cx="5612130" cy="2205990"/>
+                    </a:xfrm>
+                    <a:prstGeom prst="rect">
+                      <a:avLst/>
+                    </a:prstGeom>
+                  </pic:spPr>
+                </pic:pic>
+              </a:graphicData>
+            </a:graphic>
+          </wp:inline>
+        </w:drawing>
+      </w:r>
+    </w:p>
+    <w:p/>
+    <w:p>
+      <w:r>
+        <w:t>Git log para recibir los commit que se han realizado</w:t>
+      </w:r>
+    </w:p>
+    <w:p>
+      <w:r>
+        <w:drawing>
+          <wp:inline distT="0" distB="0" distL="0" distR="0" wp14:anchorId="709C7C6A" wp14:editId="12A9D77C">
+            <wp:extent cx="5612130" cy="2821305"/>
+            <wp:effectExtent l="0" t="0" r="7620" b="0"/>
+            <wp:docPr id="787629805" name="Imagen 1"/>
+            <wp:cNvGraphicFramePr>
+              <a:graphicFrameLocks xmlns:a="http://schemas.openxmlformats.org/drawingml/2006/main" noChangeAspect="1"/>
+            </wp:cNvGraphicFramePr>
+            <a:graphic xmlns:a="http://schemas.openxmlformats.org/drawingml/2006/main">
+              <a:graphicData uri="http://schemas.openxmlformats.org/drawingml/2006/picture">
+                <pic:pic xmlns:pic="http://schemas.openxmlformats.org/drawingml/2006/picture">
+                  <pic:nvPicPr>
+                    <pic:cNvPr id="787629805" name=""/>
+                    <pic:cNvPicPr/>
+                  </pic:nvPicPr>
+                  <pic:blipFill>
+                    <a:blip r:embed="rId16"/>
+                    <a:stretch>
+                      <a:fillRect/>
+                    </a:stretch>
+                  </pic:blipFill>
+                  <pic:spPr>
+                    <a:xfrm>
+                      <a:off x="0" y="0"/>
+                      <a:ext cx="5612130" cy="2821305"/>
+                    </a:xfrm>
+                    <a:prstGeom prst="rect">
+                      <a:avLst/>
+                    </a:prstGeom>
+                  </pic:spPr>
+                </pic:pic>
+              </a:graphicData>
+            </a:graphic>
+          </wp:inline>
+        </w:drawing>
+      </w:r>
+    </w:p>
+    <w:p/>
+    <w:p>
+      <w:r>
+        <w:t>Desarrollamos una nueva rama para desarrollo y no afectar el main de esta forma simulamos un proceso de desarrollo profesional</w:t>
+      </w:r>
+    </w:p>
+    <w:p>
+      <w:r>
+        <w:lastRenderedPageBreak/>
+        <w:drawing>
+          <wp:inline distT="0" distB="0" distL="0" distR="0" wp14:anchorId="030E4CBE" wp14:editId="1ADC6732">
+            <wp:extent cx="5612130" cy="2867025"/>
+            <wp:effectExtent l="0" t="0" r="7620" b="9525"/>
+            <wp:docPr id="1006120372" name="Imagen 1"/>
+            <wp:cNvGraphicFramePr>
+              <a:graphicFrameLocks xmlns:a="http://schemas.openxmlformats.org/drawingml/2006/main" noChangeAspect="1"/>
+            </wp:cNvGraphicFramePr>
+            <a:graphic xmlns:a="http://schemas.openxmlformats.org/drawingml/2006/main">
+              <a:graphicData uri="http://schemas.openxmlformats.org/drawingml/2006/picture">
+                <pic:pic xmlns:pic="http://schemas.openxmlformats.org/drawingml/2006/picture">
+                  <pic:nvPicPr>
+                    <pic:cNvPr id="1006120372" name=""/>
+                    <pic:cNvPicPr/>
+                  </pic:nvPicPr>
+                  <pic:blipFill>
+                    <a:blip r:embed="rId17"/>
+                    <a:stretch>
+                      <a:fillRect/>
+                    </a:stretch>
+                  </pic:blipFill>
+                  <pic:spPr>
+                    <a:xfrm>
+                      <a:off x="0" y="0"/>
+                      <a:ext cx="5612130" cy="2867025"/>
+                    </a:xfrm>
+                    <a:prstGeom prst="rect">
+                      <a:avLst/>
+                    </a:prstGeom>
+                  </pic:spPr>
+                </pic:pic>
+              </a:graphicData>
+            </a:graphic>
+          </wp:inline>
+        </w:drawing>
+      </w:r>
+    </w:p>
+    <w:p/>
+    <w:p>
+      <w:r>
+        <w:t>Para cambiar de rama</w:t>
+      </w:r>
+    </w:p>
+    <w:p>
+      <w:r>
+        <w:drawing>
+          <wp:inline distT="0" distB="0" distL="0" distR="0" wp14:anchorId="39A0327F" wp14:editId="0D07D73F">
+            <wp:extent cx="5612130" cy="1572895"/>
+            <wp:effectExtent l="0" t="0" r="7620" b="8255"/>
+            <wp:docPr id="717269102" name="Imagen 1"/>
+            <wp:cNvGraphicFramePr>
+              <a:graphicFrameLocks xmlns:a="http://schemas.openxmlformats.org/drawingml/2006/main" noChangeAspect="1"/>
+            </wp:cNvGraphicFramePr>
+            <a:graphic xmlns:a="http://schemas.openxmlformats.org/drawingml/2006/main">
+              <a:graphicData uri="http://schemas.openxmlformats.org/drawingml/2006/picture">
+                <pic:pic xmlns:pic="http://schemas.openxmlformats.org/drawingml/2006/picture">
+                  <pic:nvPicPr>
+                    <pic:cNvPr id="717269102" name=""/>
+                    <pic:cNvPicPr/>
+                  </pic:nvPicPr>
+                  <pic:blipFill>
+                    <a:blip r:embed="rId18"/>
+                    <a:stretch>
+                      <a:fillRect/>
+                    </a:stretch>
+                  </pic:blipFill>
+                  <pic:spPr>
+                    <a:xfrm>
+                      <a:off x="0" y="0"/>
+                      <a:ext cx="5612130" cy="1572895"/>
+                    </a:xfrm>
+                    <a:prstGeom prst="rect">
+                      <a:avLst/>
+                    </a:prstGeom>
+                  </pic:spPr>
+                </pic:pic>
+              </a:graphicData>
+            </a:graphic>
+          </wp:inline>
+        </w:drawing>
+      </w:r>
+    </w:p>
+    <w:p/>
+    <w:p>
+      <w:r>
+        <w:t>Aca se crea la siguiente rama</w:t>
+      </w:r>
+    </w:p>
+    <w:p>
+      <w:r>
+        <w:drawing>
+          <wp:inline distT="0" distB="0" distL="0" distR="0" wp14:anchorId="16C50BE7" wp14:editId="59A2C97E">
+            <wp:extent cx="5612130" cy="1292860"/>
+            <wp:effectExtent l="0" t="0" r="7620" b="2540"/>
+            <wp:docPr id="1233064125" name="Imagen 1"/>
+            <wp:cNvGraphicFramePr>
+              <a:graphicFrameLocks xmlns:a="http://schemas.openxmlformats.org/drawingml/2006/main" noChangeAspect="1"/>
+            </wp:cNvGraphicFramePr>
+            <a:graphic xmlns:a="http://schemas.openxmlformats.org/drawingml/2006/main">
+              <a:graphicData uri="http://schemas.openxmlformats.org/drawingml/2006/picture">
+                <pic:pic xmlns:pic="http://schemas.openxmlformats.org/drawingml/2006/picture">
+                  <pic:nvPicPr>
+                    <pic:cNvPr id="1233064125" name=""/>
+                    <pic:cNvPicPr/>
+                  </pic:nvPicPr>
+                  <pic:blipFill>
+                    <a:blip r:embed="rId19"/>
+                    <a:stretch>
+                      <a:fillRect/>
+                    </a:stretch>
+                  </pic:blipFill>
+                  <pic:spPr>
+                    <a:xfrm>
+                      <a:off x="0" y="0"/>
+                      <a:ext cx="5612130" cy="1292860"/>
+                    </a:xfrm>
+                    <a:prstGeom prst="rect">
+                      <a:avLst/>
+                    </a:prstGeom>
+                  </pic:spPr>
+                </pic:pic>
+              </a:graphicData>
+            </a:graphic>
+          </wp:inline>
+        </w:drawing>
+      </w:r>
+    </w:p>
+    <w:p/>
+    <w:p>
+      <w:r>
+        <w:t>Verificamos las ramas creadas</w:t>
+      </w:r>
+    </w:p>
+    <w:p>
+      <w:r>
+        <w:lastRenderedPageBreak/>
+        <w:drawing>
+          <wp:inline distT="0" distB="0" distL="0" distR="0" wp14:anchorId="0B299C4C" wp14:editId="285623E2">
+            <wp:extent cx="5612130" cy="2055495"/>
+            <wp:effectExtent l="0" t="0" r="7620" b="1905"/>
+            <wp:docPr id="806501674" name="Imagen 1"/>
+            <wp:cNvGraphicFramePr>
+              <a:graphicFrameLocks xmlns:a="http://schemas.openxmlformats.org/drawingml/2006/main" noChangeAspect="1"/>
+            </wp:cNvGraphicFramePr>
+            <a:graphic xmlns:a="http://schemas.openxmlformats.org/drawingml/2006/main">
+              <a:graphicData uri="http://schemas.openxmlformats.org/drawingml/2006/picture">
+                <pic:pic xmlns:pic="http://schemas.openxmlformats.org/drawingml/2006/picture">
+                  <pic:nvPicPr>
+                    <pic:cNvPr id="806501674" name=""/>
+                    <pic:cNvPicPr/>
+                  </pic:nvPicPr>
+                  <pic:blipFill>
+                    <a:blip r:embed="rId20"/>
+                    <a:stretch>
+                      <a:fillRect/>
+                    </a:stretch>
+                  </pic:blipFill>
+                  <pic:spPr>
+                    <a:xfrm>
+                      <a:off x="0" y="0"/>
+                      <a:ext cx="5612130" cy="2055495"/>
+                    </a:xfrm>
+                    <a:prstGeom prst="rect">
+                      <a:avLst/>
+                    </a:prstGeom>
+                  </pic:spPr>
+                </pic:pic>
+              </a:graphicData>
+            </a:graphic>
+          </wp:inline>
+        </w:drawing>
+      </w:r>
+    </w:p>
+    <w:p/>
+    <w:p>
+      <w:r>
+        <w:t>Como eliminamos la rama feature por cometer error de estructura</w:t>
+      </w:r>
+    </w:p>
+    <w:p>
+      <w:r>
+        <w:drawing>
+          <wp:inline distT="0" distB="0" distL="0" distR="0" wp14:anchorId="5A589B48" wp14:editId="66F436F3">
+            <wp:extent cx="5612130" cy="2220595"/>
+            <wp:effectExtent l="0" t="0" r="7620" b="8255"/>
+            <wp:docPr id="1009346085" name="Imagen 1"/>
+            <wp:cNvGraphicFramePr>
+              <a:graphicFrameLocks xmlns:a="http://schemas.openxmlformats.org/drawingml/2006/main" noChangeAspect="1"/>
+            </wp:cNvGraphicFramePr>
+            <a:graphic xmlns:a="http://schemas.openxmlformats.org/drawingml/2006/main">
+              <a:graphicData uri="http://schemas.openxmlformats.org/drawingml/2006/picture">
+                <pic:pic xmlns:pic="http://schemas.openxmlformats.org/drawingml/2006/picture">
+                  <pic:nvPicPr>
+                    <pic:cNvPr id="1009346085" name=""/>
+                    <pic:cNvPicPr/>
+                  </pic:nvPicPr>
+                  <pic:blipFill>
+                    <a:blip r:embed="rId21"/>
+                    <a:stretch>
+                      <a:fillRect/>
+                    </a:stretch>
+                  </pic:blipFill>
+                  <pic:spPr>
+                    <a:xfrm>
+                      <a:off x="0" y="0"/>
+                      <a:ext cx="5612130" cy="2220595"/>
+                    </a:xfrm>
+                    <a:prstGeom prst="rect">
+                      <a:avLst/>
+                    </a:prstGeom>
+                  </pic:spPr>
+                </pic:pic>
+              </a:graphicData>
+            </a:graphic>
+          </wp:inline>
+        </w:drawing>
+      </w:r>
+    </w:p>
+    <w:p/>
+    <w:p>
+      <w:r>
+        <w:t>Eliminamos otra rama como estructura-inicial</w:t>
+      </w:r>
+    </w:p>
+    <w:p>
+      <w:r>
+        <w:lastRenderedPageBreak/>
+        <w:drawing>
+          <wp:inline distT="0" distB="0" distL="0" distR="0" wp14:anchorId="78D7E777" wp14:editId="663D6188">
+            <wp:extent cx="5612130" cy="2646045"/>
+            <wp:effectExtent l="0" t="0" r="7620" b="1905"/>
+            <wp:docPr id="771909553" name="Imagen 1"/>
+            <wp:cNvGraphicFramePr>
+              <a:graphicFrameLocks xmlns:a="http://schemas.openxmlformats.org/drawingml/2006/main" noChangeAspect="1"/>
+            </wp:cNvGraphicFramePr>
+            <a:graphic xmlns:a="http://schemas.openxmlformats.org/drawingml/2006/main">
+              <a:graphicData uri="http://schemas.openxmlformats.org/drawingml/2006/picture">
+                <pic:pic xmlns:pic="http://schemas.openxmlformats.org/drawingml/2006/picture">
+                  <pic:nvPicPr>
+                    <pic:cNvPr id="771909553" name=""/>
+                    <pic:cNvPicPr/>
+                  </pic:nvPicPr>
+                  <pic:blipFill>
+                    <a:blip r:embed="rId22"/>
+                    <a:stretch>
+                      <a:fillRect/>
+                    </a:stretch>
+                  </pic:blipFill>
+                  <pic:spPr>
+                    <a:xfrm>
+                      <a:off x="0" y="0"/>
+                      <a:ext cx="5612130" cy="2646045"/>
+                    </a:xfrm>
+                    <a:prstGeom prst="rect">
+                      <a:avLst/>
+                    </a:prstGeom>
+                  </pic:spPr>
+                </pic:pic>
+              </a:graphicData>
+            </a:graphic>
+          </wp:inline>
+        </w:drawing>
+      </w:r>
+    </w:p>
+    <w:p/>
+    <w:p>
+      <w:r>
+        <w:t>Creamos nuestro priemer feature/estructura-inicial para iniciar trabajos</w:t>
+      </w:r>
+    </w:p>
+    <w:p>
+      <w:r>
+        <w:drawing>
+          <wp:inline distT="0" distB="0" distL="0" distR="0" wp14:anchorId="1DED020B" wp14:editId="4FACFC3B">
+            <wp:extent cx="5612130" cy="1112520"/>
+            <wp:effectExtent l="0" t="0" r="7620" b="0"/>
+            <wp:docPr id="1380372632" name="Imagen 1"/>
+            <wp:cNvGraphicFramePr>
+              <a:graphicFrameLocks xmlns:a="http://schemas.openxmlformats.org/drawingml/2006/main" noChangeAspect="1"/>
+            </wp:cNvGraphicFramePr>
+            <a:graphic xmlns:a="http://schemas.openxmlformats.org/drawingml/2006/main">
+              <a:graphicData uri="http://schemas.openxmlformats.org/drawingml/2006/picture">
+                <pic:pic xmlns:pic="http://schemas.openxmlformats.org/drawingml/2006/picture">
+                  <pic:nvPicPr>
+                    <pic:cNvPr id="1380372632" name=""/>
+                    <pic:cNvPicPr/>
+                  </pic:nvPicPr>
+                  <pic:blipFill>
+                    <a:blip r:embed="rId23"/>
+                    <a:stretch>
+                      <a:fillRect/>
+                    </a:stretch>
+                  </pic:blipFill>
+                  <pic:spPr>
+                    <a:xfrm>
+                      <a:off x="0" y="0"/>
+                      <a:ext cx="5612130" cy="1112520"/>
+                    </a:xfrm>
+                    <a:prstGeom prst="rect">
+                      <a:avLst/>
+                    </a:prstGeom>
+                  </pic:spPr>
+                </pic:pic>
+              </a:graphicData>
+            </a:graphic>
+          </wp:inline>
+        </w:drawing>
+      </w:r>
+    </w:p>
+    <w:p/>
+    <w:p>
+      <w:r>
+        <w:t>Subido a github</w:t>
+      </w:r>
+    </w:p>
+    <w:p>
+      <w:r>
+        <w:drawing>
+          <wp:inline distT="0" distB="0" distL="0" distR="0" wp14:anchorId="2417C87F" wp14:editId="6083380B">
+            <wp:extent cx="5612130" cy="1801495"/>
+            <wp:effectExtent l="0" t="0" r="7620" b="8255"/>
+            <wp:docPr id="619269213" name="Imagen 1"/>
+            <wp:cNvGraphicFramePr>
+              <a:graphicFrameLocks xmlns:a="http://schemas.openxmlformats.org/drawingml/2006/main" noChangeAspect="1"/>
+            </wp:cNvGraphicFramePr>
+            <a:graphic xmlns:a="http://schemas.openxmlformats.org/drawingml/2006/main">
+              <a:graphicData uri="http://schemas.openxmlformats.org/drawingml/2006/picture">
+                <pic:pic xmlns:pic="http://schemas.openxmlformats.org/drawingml/2006/picture">
+                  <pic:nvPicPr>
+                    <pic:cNvPr id="619269213" name=""/>
+                    <pic:cNvPicPr/>
+                  </pic:nvPicPr>
+                  <pic:blipFill>
+                    <a:blip r:embed="rId24"/>
+                    <a:stretch>
+                      <a:fillRect/>
+                    </a:stretch>
+                  </pic:blipFill>
+                  <pic:spPr>
+                    <a:xfrm>
+                      <a:off x="0" y="0"/>
+                      <a:ext cx="5612130" cy="1801495"/>
+                    </a:xfrm>
+                    <a:prstGeom prst="rect">
+                      <a:avLst/>
+                    </a:prstGeom>
+                  </pic:spPr>
+                </pic:pic>
+              </a:graphicData>
+            </a:graphic>
+          </wp:inline>
+        </w:drawing>
+      </w:r>
+    </w:p>
+    <w:p/>
+    <w:p>
+      <w:r>
+        <w:t>Asi queda la primera estructura</w:t>
+      </w:r>
+    </w:p>
+    <w:p>
+      <w:r>
+        <w:lastRenderedPageBreak/>
+        <w:drawing>
+          <wp:inline distT="0" distB="0" distL="0" distR="0" wp14:anchorId="0397CCC3" wp14:editId="124A3ADE">
+            <wp:extent cx="5612130" cy="1275715"/>
+            <wp:effectExtent l="0" t="0" r="7620" b="635"/>
+            <wp:docPr id="106422877" name="Imagen 1"/>
+            <wp:cNvGraphicFramePr>
+              <a:graphicFrameLocks xmlns:a="http://schemas.openxmlformats.org/drawingml/2006/main" noChangeAspect="1"/>
+            </wp:cNvGraphicFramePr>
+            <a:graphic xmlns:a="http://schemas.openxmlformats.org/drawingml/2006/main">
+              <a:graphicData uri="http://schemas.openxmlformats.org/drawingml/2006/picture">
+                <pic:pic xmlns:pic="http://schemas.openxmlformats.org/drawingml/2006/picture">
+                  <pic:nvPicPr>
+                    <pic:cNvPr id="106422877" name=""/>
+                    <pic:cNvPicPr/>
+                  </pic:nvPicPr>
+                  <pic:blipFill>
+                    <a:blip r:embed="rId25"/>
+                    <a:stretch>
+                      <a:fillRect/>
+                    </a:stretch>
+                  </pic:blipFill>
+                  <pic:spPr>
+                    <a:xfrm>
+                      <a:off x="0" y="0"/>
+                      <a:ext cx="5612130" cy="1275715"/>
+                    </a:xfrm>
+                    <a:prstGeom prst="rect">
+                      <a:avLst/>
+                    </a:prstGeom>
+                  </pic:spPr>
+                </pic:pic>
+              </a:graphicData>
+            </a:graphic>
+          </wp:inline>
+        </w:drawing>
+      </w:r>
+    </w:p>
+    <w:p/>
+    <w:p/>
     <w:sectPr>
       <w:pgSz w:w="12240" w:h="15840"/>
       <w:pgMar w:top="1417" w:right="1701" w:bottom="1417" w:left="1701" w:header="708" w:footer="708" w:gutter="0"/>

</xml_diff>

<commit_message>
fix: correccion de index.html y readme.md
</commit_message>
<xml_diff>
--- a/doc/Documentacion.docx
+++ b/doc/Documentacion.docx
@@ -979,6 +979,51 @@
                     <a:xfrm>
                       <a:off x="0" y="0"/>
                       <a:ext cx="5612130" cy="1275715"/>
+                    </a:xfrm>
+                    <a:prstGeom prst="rect">
+                      <a:avLst/>
+                    </a:prstGeom>
+                  </pic:spPr>
+                </pic:pic>
+              </a:graphicData>
+            </a:graphic>
+          </wp:inline>
+        </w:drawing>
+      </w:r>
+    </w:p>
+    <w:p/>
+    <w:p>
+      <w:r>
+        <w:t>Subir los ficheros creados y editados a github</w:t>
+      </w:r>
+    </w:p>
+    <w:p>
+      <w:r>
+        <w:drawing>
+          <wp:inline distT="0" distB="0" distL="0" distR="0" wp14:anchorId="55860D6D" wp14:editId="2448271D">
+            <wp:extent cx="5612130" cy="3493770"/>
+            <wp:effectExtent l="0" t="0" r="7620" b="0"/>
+            <wp:docPr id="899940132" name="Imagen 1"/>
+            <wp:cNvGraphicFramePr>
+              <a:graphicFrameLocks xmlns:a="http://schemas.openxmlformats.org/drawingml/2006/main" noChangeAspect="1"/>
+            </wp:cNvGraphicFramePr>
+            <a:graphic xmlns:a="http://schemas.openxmlformats.org/drawingml/2006/main">
+              <a:graphicData uri="http://schemas.openxmlformats.org/drawingml/2006/picture">
+                <pic:pic xmlns:pic="http://schemas.openxmlformats.org/drawingml/2006/picture">
+                  <pic:nvPicPr>
+                    <pic:cNvPr id="899940132" name=""/>
+                    <pic:cNvPicPr/>
+                  </pic:nvPicPr>
+                  <pic:blipFill>
+                    <a:blip r:embed="rId26"/>
+                    <a:stretch>
+                      <a:fillRect/>
+                    </a:stretch>
+                  </pic:blipFill>
+                  <pic:spPr>
+                    <a:xfrm>
+                      <a:off x="0" y="0"/>
+                      <a:ext cx="5612130" cy="3493770"/>
                     </a:xfrm>
                     <a:prstGeom prst="rect">
                       <a:avLst/>

</xml_diff>